<commit_message>
Rebuild projects as case studies, add a brand intro and mini games, and fix credits.
- Projects: a "Selected work" list with full-page case studies, real app
  screens in Android phones, live sites in laptops, and walkthrough videos.
- Kusina Kode: latest app screens, the admin site and both walkthroughs.
- MakiRide replaces ShuttleCock, with screens from the Figma export.
- BNK WMS: the live site, the prototype, and credit as prototype lead and
  co-author only. The résumé now says the same.
- Cloud work shown as one unnamed set of AWS and Azure diagrams.
- Shooting-star brand intro replaces the laptop; portfolio-style hero.
- Three mini games in Play; Pixels of Meaning moved there.
- Milestones and recognition moved to their own section; ambassador years
  corrected to 2023 to 2025, with the program-page photo.
- Link preview, banners and email signature point at the real address.
</commit_message>
<xml_diff>
--- a/assets/docs/De_Roxas_Jhan_Maurice_CV_ATS.docx
+++ b/assets/docs/De_Roxas_Jhan_Maurice_CV_ATS.docx
@@ -572,7 +572,7 @@
           <w:b/>
           <w:sz w:val="22"/>
         </w:rPr>
-        <w:t>BNK WMS: Pet Boarding and Grooming System  |  2026</w:t>
+        <w:t>BNK WMS: Pet Grooming and Boarding Management System  |  2026  |  bnkpets.infinityfreeapp.com</w:t>
       </w:r>
     </w:p>
     <w:p>
@@ -586,7 +586,7 @@
           <w:color w:val="55505F"/>
           <w:sz w:val="20"/>
         </w:rPr>
-        <w:t>Team lead / project manager  |  Full-stack developer  |  RFID integration</w:t>
+        <w:t>Team lead (prototype)  |  Co-author (implementation and documentation)</w:t>
       </w:r>
     </w:p>
     <w:p>
@@ -600,7 +600,7 @@
           <w:b w:val="0"/>
           <w:sz w:val="22"/>
         </w:rPr>
-        <w:t>278-file PHP application for a real grooming and boarding shop: customer booking, staff operations, and admin configuration.</w:t>
+        <w:t>A live web system for a real grooming and boarding shop: online booking, RFID check-in at the counter, and admin reports.</w:t>
       </w:r>
     </w:p>
     <w:p>
@@ -614,7 +614,7 @@
           <w:b w:val="0"/>
           <w:sz w:val="22"/>
         </w:rPr>
-        <w:t>Designed the MySQL schema and the RFID scan, lookup, and last-scan API used at the counter. Staff send boarding updates; admins pull PDF reports.</w:t>
+        <w:t>Led the team through the Figma prototype, then co-authored the PHP and MySQL implementation and the project documentation with the team.</w:t>
       </w:r>
     </w:p>
     <w:p>
@@ -682,7 +682,7 @@
           <w:b/>
           <w:sz w:val="22"/>
         </w:rPr>
-        <w:t>AWS-ome Tech: Cloud Infrastructure for a Retail Client  |  IT191-4P  |  2026</w:t>
+        <w:t>Cloud Architecture Diagrams  |  IT191 Cloud Computing and Capstone  |  2025 to 2026</w:t>
       </w:r>
     </w:p>
     <w:p>
@@ -696,7 +696,7 @@
           <w:color w:val="55505F"/>
           <w:sz w:val="20"/>
         </w:rPr>
-        <w:t>Project manager  |  Cloud infrastructure and documentation</w:t>
+        <w:t>Cloud architecture and diagramming</w:t>
       </w:r>
     </w:p>
     <w:p>
@@ -710,7 +710,7 @@
           <w:b w:val="0"/>
           <w:sz w:val="22"/>
         </w:rPr>
-        <w:t>Target-state AWS for a client with no existing cloud: two-AZ VPC, public and private subnets, EC2, RDS MySQL, S3, IAM, CloudWatch, SNS, and AWS Backup.</w:t>
+        <w:t>Drew AWS and Azure architecture, network and security diagrams: a two-AZ VPC with public and private subnets, EC2, RDS MySQL, S3, IAM and CloudWatch; Azure App Service, SQL Database, Blob Storage and Key Vault.</w:t>
       </w:r>
     </w:p>
     <w:p>
@@ -724,7 +724,7 @@
           <w:b w:val="0"/>
           <w:sz w:val="22"/>
         </w:rPr>
-        <w:t>Delivered the handover set: design document, deployment guide, administrator guide, knowledge-transfer notes, operations runbook, and cost report.</w:t>
+        <w:t>Mapped each requirement to the service that meets it, and wrote the documents behind the diagrams: design, deployment and administrator guides, runbook, and cost report.</w:t>
       </w:r>
     </w:p>
     <w:p>
@@ -806,7 +806,7 @@
           <w:b w:val="0"/>
           <w:sz w:val="22"/>
         </w:rPr>
-        <w:t>ShuttleCock / MakiRide: project contributor and user-journey author on a campus shuttle booking design in Figma (100+ screens), later evolved into MakiRide.</w:t>
+        <w:t>MakiRide: designer and user-journey author on a campus ride booking and carpooling app in Figma, later pitched as a product for Technopreneurship.</w:t>
       </w:r>
     </w:p>
     <w:p>

</xml_diff>